<commit_message>
add data and fixes
</commit_message>
<xml_diff>
--- a/report/Clinical_Trial_MAS_Report.docx
+++ b/report/Clinical_Trial_MAS_Report.docx
@@ -1631,7 +1631,7 @@
     </w:p>
     <w:p>
       <w:r>
-        <w:t>No external dataset is used. All parameters (budgets, dose-response, recruitment rates, constraints) are synthetic and defined in scenarios.py; the models in trial_tools.py are simplified analytic approximations. No patient data is used.</w:t>
+        <w:t>The scenarios are synthetic, defined in scenarios.py with the starting values of the case-study report (320 patients, Sponsor cap 220 and target 180, 10 hospitals, 2 dose arms, 18 months). They are validated against real data: 5,000 completed Phase II interventional trials fetched from the ClinicalTrials.gov API v2 (fetch_real_data.py, accessed 2026-10-14). Position of the starting values in the real distribution: 320 patients = 92nd percentile, cap 220 = 88th, target 180 = 83rd, 10 hospitals = 54th percentile of multi-site trials, 18 months = 29th percentile; 2 arms is the real median. Real medians: enrolment 56 (IQR 29-122), duration 32 months (IQR 16-57). The baseline is therefore a deliberately large, expensive Phase II draft, and its final protocol of 180 patients is still above the real 80th percentile. Cost per patient, dose-response and constraint thresholds are not recorded in the registry and remain synthetic. No patient-level data is used.</w:t>
       </w:r>
     </w:p>
     <w:p>
@@ -1716,7 +1716,7 @@
     </w:p>
     <w:p>
       <w:r>
-        <w:t>Command-line interface (main.py): --mode {multi-agent,baseline,compare}, --scenario {name|all}, --llm, --max-rounds, --no-transcript, --summary, --output-dir, --verbose. Results are shown as a readable transcript and final-result summary and saved to outputs/.</w:t>
+        <w:t>Web UI (streamlit run app.py): scenario picker, round-by-round negotiation, protocol evolution charts, single-vs-multi-agent comparison and constraint audit (Figures 7-10). Command-line interface (main.py): --mode {multi-agent,baseline,compare}, --scenario {name|all}, --llm, --max-rounds, --no-transcript, --summary, --output-dir, --verbose. Results are shown as a readable transcript and final-result summary and saved to outputs/.</w:t>
       </w:r>
     </w:p>
     <w:p>
@@ -3624,7 +3624,7 @@
     <w:p/>
     <w:p>
       <w:r>
-        <w:t>Discussion: in the baseline scenario the Sponsor's first cut (320 -&gt; 180 patients) is blocked by the Biostatistician because power would fall too low; the IRB lowers the dosage to 75 mg and tightens exclusions; the Patient Advocate's visit reduction is only accepted once the Sponsor funds remote monitoring. The final protocol has power 0.847 and zero violations. The single-agent baseline, given all constraints in one place, still produced 4-10 violations because trade-offs are soft penalties with no veto. The baseline is intentionally naive, so this shows the effect of silent trade-offs, not that a well-engineered optimiser could never satisfy the constraints.</w:t>
+        <w:t>Discussion: in the baseline scenario the Sponsor cut from 320 to 180 patients is blocked by the Biostatistician because power would fall to about 0.64; the IRB lowers the dosage to 75 mg and tightens exclusions; the Patient Advocate visit reduction is accepted only once the Sponsor funds remote monitoring. The final protocol has power 0.847 and zero violations. The single-agent baseline, given all constraints in one place, still produced 4-10 violations because trade-offs are soft penalties with no veto. The baseline is intentionally naive, so this shows the effect of silent trade-offs, not that a well-engineered optimiser could never satisfy the constraints.</w:t>
       </w:r>
     </w:p>
     <w:p>
@@ -3884,6 +3884,170 @@
     <w:p>
       <w:r>
         <w:t>Figure 6: Automated test run - 96 passed.</w:t>
+      </w:r>
+    </w:p>
+    <w:p>
+      <w:r>
+        <w:drawing>
+          <wp:inline xmlns:a="http://schemas.openxmlformats.org/drawingml/2006/main" xmlns:pic="http://schemas.openxmlformats.org/drawingml/2006/picture">
+            <wp:extent cx="5669280" cy="3644537"/>
+            <wp:docPr id="7" name="Picture 7"/>
+            <wp:cNvGraphicFramePr>
+              <a:graphicFrameLocks noChangeAspect="1"/>
+            </wp:cNvGraphicFramePr>
+            <a:graphic>
+              <a:graphicData uri="http://schemas.openxmlformats.org/drawingml/2006/picture">
+                <pic:pic>
+                  <pic:nvPicPr>
+                    <pic:cNvPr id="0" name="ui_01_negotiation.png"/>
+                    <pic:cNvPicPr/>
+                  </pic:nvPicPr>
+                  <pic:blipFill>
+                    <a:blip r:embed="rId15"/>
+                    <a:stretch>
+                      <a:fillRect/>
+                    </a:stretch>
+                  </pic:blipFill>
+                  <pic:spPr>
+                    <a:xfrm>
+                      <a:off x="0" y="0"/>
+                      <a:ext cx="5669280" cy="3644537"/>
+                    </a:xfrm>
+                    <a:prstGeom prst="rect"/>
+                  </pic:spPr>
+                </pic:pic>
+              </a:graphicData>
+            </a:graphic>
+          </wp:inline>
+        </w:drawing>
+      </w:r>
+    </w:p>
+    <w:p>
+      <w:r>
+        <w:t>Figure 7: Web UI - negotiation view with per-round agent decisions.</w:t>
+      </w:r>
+    </w:p>
+    <w:p>
+      <w:r>
+        <w:drawing>
+          <wp:inline xmlns:a="http://schemas.openxmlformats.org/drawingml/2006/main" xmlns:pic="http://schemas.openxmlformats.org/drawingml/2006/picture">
+            <wp:extent cx="5669280" cy="3644537"/>
+            <wp:docPr id="8" name="Picture 8"/>
+            <wp:cNvGraphicFramePr>
+              <a:graphicFrameLocks noChangeAspect="1"/>
+            </wp:cNvGraphicFramePr>
+            <a:graphic>
+              <a:graphicData uri="http://schemas.openxmlformats.org/drawingml/2006/picture">
+                <pic:pic>
+                  <pic:nvPicPr>
+                    <pic:cNvPr id="0" name="ui_02_protocol.png"/>
+                    <pic:cNvPicPr/>
+                  </pic:nvPicPr>
+                  <pic:blipFill>
+                    <a:blip r:embed="rId16"/>
+                    <a:stretch>
+                      <a:fillRect/>
+                    </a:stretch>
+                  </pic:blipFill>
+                  <pic:spPr>
+                    <a:xfrm>
+                      <a:off x="0" y="0"/>
+                      <a:ext cx="5669280" cy="3644537"/>
+                    </a:xfrm>
+                    <a:prstGeom prst="rect"/>
+                  </pic:spPr>
+                </pic:pic>
+              </a:graphicData>
+            </a:graphic>
+          </wp:inline>
+        </w:drawing>
+      </w:r>
+    </w:p>
+    <w:p>
+      <w:r>
+        <w:t>Figure 8: Web UI - protocol evolution table and power / budget charts.</w:t>
+      </w:r>
+    </w:p>
+    <w:p>
+      <w:r>
+        <w:drawing>
+          <wp:inline xmlns:a="http://schemas.openxmlformats.org/drawingml/2006/main" xmlns:pic="http://schemas.openxmlformats.org/drawingml/2006/picture">
+            <wp:extent cx="5669280" cy="3644537"/>
+            <wp:docPr id="9" name="Picture 9"/>
+            <wp:cNvGraphicFramePr>
+              <a:graphicFrameLocks noChangeAspect="1"/>
+            </wp:cNvGraphicFramePr>
+            <a:graphic>
+              <a:graphicData uri="http://schemas.openxmlformats.org/drawingml/2006/picture">
+                <pic:pic>
+                  <pic:nvPicPr>
+                    <pic:cNvPr id="0" name="ui_03_comparison.png"/>
+                    <pic:cNvPicPr/>
+                  </pic:nvPicPr>
+                  <pic:blipFill>
+                    <a:blip r:embed="rId17"/>
+                    <a:stretch>
+                      <a:fillRect/>
+                    </a:stretch>
+                  </pic:blipFill>
+                  <pic:spPr>
+                    <a:xfrm>
+                      <a:off x="0" y="0"/>
+                      <a:ext cx="5669280" cy="3644537"/>
+                    </a:xfrm>
+                    <a:prstGeom prst="rect"/>
+                  </pic:spPr>
+                </pic:pic>
+              </a:graphicData>
+            </a:graphic>
+          </wp:inline>
+        </w:drawing>
+      </w:r>
+    </w:p>
+    <w:p>
+      <w:r>
+        <w:t>Figure 9: Web UI - multi-agent vs single-agent comparison.</w:t>
+      </w:r>
+    </w:p>
+    <w:p>
+      <w:r>
+        <w:drawing>
+          <wp:inline xmlns:a="http://schemas.openxmlformats.org/drawingml/2006/main" xmlns:pic="http://schemas.openxmlformats.org/drawingml/2006/picture">
+            <wp:extent cx="5669280" cy="3644537"/>
+            <wp:docPr id="10" name="Picture 10"/>
+            <wp:cNvGraphicFramePr>
+              <a:graphicFrameLocks noChangeAspect="1"/>
+            </wp:cNvGraphicFramePr>
+            <a:graphic>
+              <a:graphicData uri="http://schemas.openxmlformats.org/drawingml/2006/picture">
+                <pic:pic>
+                  <pic:nvPicPr>
+                    <pic:cNvPr id="0" name="ui_04_audit.png"/>
+                    <pic:cNvPicPr/>
+                  </pic:nvPicPr>
+                  <pic:blipFill>
+                    <a:blip r:embed="rId18"/>
+                    <a:stretch>
+                      <a:fillRect/>
+                    </a:stretch>
+                  </pic:blipFill>
+                  <pic:spPr>
+                    <a:xfrm>
+                      <a:off x="0" y="0"/>
+                      <a:ext cx="5669280" cy="3644537"/>
+                    </a:xfrm>
+                    <a:prstGeom prst="rect"/>
+                  </pic:spPr>
+                </pic:pic>
+              </a:graphicData>
+            </a:graphic>
+          </wp:inline>
+        </w:drawing>
+      </w:r>
+    </w:p>
+    <w:p>
+      <w:r>
+        <w:t>Figure 10: Web UI - independent constraint audit.</w:t>
       </w:r>
     </w:p>
     <w:sectPr>

</xml_diff>